<commit_message>
updates flyer for HCC 37
</commit_message>
<xml_diff>
--- a/docs/HC Challenge XXXVII (Flyer).docx
+++ b/docs/HC Challenge XXXVII (Flyer).docx
@@ -2,6 +2,18 @@
 <file path=word/document.xml><?xml version="1.0" encoding="utf-8"?>
 <w:document xmlns:wpc="http://schemas.microsoft.com/office/word/2010/wordprocessingCanvas" xmlns:cx="http://schemas.microsoft.com/office/drawing/2014/chartex" xmlns:cx1="http://schemas.microsoft.com/office/drawing/2015/9/8/chartex" xmlns:cx2="http://schemas.microsoft.com/office/drawing/2015/10/21/chartex" xmlns:cx3="http://schemas.microsoft.com/office/drawing/2016/5/9/chartex" xmlns:cx4="http://schemas.microsoft.com/office/drawing/2016/5/10/chartex" xmlns:cx5="http://schemas.microsoft.com/office/drawing/2016/5/11/chartex" xmlns:cx6="http://schemas.microsoft.com/office/drawing/2016/5/12/chartex" xmlns:cx7="http://schemas.microsoft.com/office/drawing/2016/5/13/chartex" xmlns:cx8="http://schemas.microsoft.com/office/drawing/2016/5/14/chartex" xmlns:mc="http://schemas.openxmlformats.org/markup-compatibility/2006" xmlns:aink="http://schemas.microsoft.com/office/drawing/2016/ink" xmlns:am3d="http://schemas.microsoft.com/office/drawing/2017/model3d" xmlns:o="urn:schemas-microsoft-com:office:office" xmlns:oel="http://schemas.microsoft.com/office/2019/extlst" xmlns:r="http://schemas.openxmlformats.org/officeDocument/2006/relationships" xmlns:m="http://schemas.openxmlformats.org/officeDocument/2006/math" xmlns:v="urn:schemas-microsoft-com:vml" xmlns:wp14="http://schemas.microsoft.com/office/word/2010/wordprocessingDrawing" xmlns:wp="http://schemas.openxmlformats.org/drawingml/2006/wordprocessingDrawing" xmlns:w10="urn:schemas-microsoft-com:office:word" xmlns:w="http://schemas.openxmlformats.org/wordprocessingml/2006/main" xmlns:w14="http://schemas.microsoft.com/office/word/2010/wordml" xmlns:w15="http://schemas.microsoft.com/office/word/2012/wordml" xmlns:w16cex="http://schemas.microsoft.com/office/word/2018/wordml/cex" xmlns:w16cid="http://schemas.microsoft.com/office/word/2016/wordml/cid" xmlns:w16="http://schemas.microsoft.com/office/word/2018/wordml" xmlns:w16du="http://schemas.microsoft.com/office/word/2023/wordml/word16du" xmlns:w16sdtdh="http://schemas.microsoft.com/office/word/2020/wordml/sdtdatahash" xmlns:w16sdtfl="http://schemas.microsoft.com/office/word/2024/wordml/sdtformatlock" xmlns:w16se="http://schemas.microsoft.com/office/word/2015/wordml/symex" xmlns:wpg="http://schemas.microsoft.com/office/word/2010/wordprocessingGroup" xmlns:wpi="http://schemas.microsoft.com/office/word/2010/wordprocessingInk" xmlns:wne="http://schemas.microsoft.com/office/word/2006/wordml" xmlns:wps="http://schemas.microsoft.com/office/word/2010/wordprocessingShape" mc:Ignorable="w14 w15 w16se w16cid w16 w16cex w16sdtdh w16sdtfl w16du wp14">
   <w:body>
+    <w:p>
+      <w:pPr>
+        <w:jc w:val="center"/>
+        <w:rPr>
+          <w:rFonts w:ascii="Arial" w:hAnsi="Arial" w:cs="Arial"/>
+          <w:b/>
+          <w:bCs/>
+          <w:sz w:val="28"/>
+          <w:szCs w:val="28"/>
+        </w:rPr>
+      </w:pPr>
+    </w:p>
     <w:p>
       <w:pPr>
         <w:jc w:val="center"/>
@@ -1556,104 +1568,6 @@
     </w:p>
     <w:p>
       <w:pPr>
-        <w:rPr>
-          <w:rFonts w:ascii="Arial" w:hAnsi="Arial" w:cs="Arial"/>
-          <w:sz w:val="22"/>
-          <w:szCs w:val="22"/>
-        </w:rPr>
-      </w:pPr>
-    </w:p>
-    <w:p>
-      <w:pPr>
-        <w:jc w:val="center"/>
-        <w:rPr>
-          <w:rFonts w:ascii="Arial" w:hAnsi="Arial" w:cs="Arial"/>
-          <w:b/>
-          <w:sz w:val="22"/>
-          <w:szCs w:val="22"/>
-        </w:rPr>
-      </w:pPr>
-      <w:proofErr w:type="spellStart"/>
-      <w:r>
-        <w:rPr>
-          <w:rFonts w:ascii="Arial" w:hAnsi="Arial" w:cs="Arial"/>
-          <w:b/>
-          <w:sz w:val="22"/>
-          <w:szCs w:val="22"/>
-        </w:rPr>
-        <w:t>Goddesschess</w:t>
-      </w:r>
-      <w:proofErr w:type="spellEnd"/>
-      <w:r>
-        <w:rPr>
-          <w:rFonts w:ascii="Arial" w:hAnsi="Arial" w:cs="Arial"/>
-          <w:b/>
-          <w:sz w:val="22"/>
-          <w:szCs w:val="22"/>
-        </w:rPr>
-        <w:t xml:space="preserve"> Prizes</w:t>
-      </w:r>
-      <w:r>
-        <w:rPr>
-          <w:rFonts w:ascii="Arial" w:hAnsi="Arial" w:cs="Arial"/>
-          <w:sz w:val="22"/>
-          <w:szCs w:val="22"/>
-        </w:rPr>
-        <w:t xml:space="preserve"> </w:t>
-      </w:r>
-      <w:r>
-        <w:rPr>
-          <w:rFonts w:ascii="Arial" w:hAnsi="Arial" w:cs="Arial"/>
-          <w:sz w:val="22"/>
-          <w:szCs w:val="22"/>
-        </w:rPr>
-        <w:t xml:space="preserve">(for females) </w:t>
-      </w:r>
-      <w:r>
-        <w:rPr>
-          <w:rFonts w:ascii="Arial" w:hAnsi="Arial" w:cs="Arial"/>
-          <w:b/>
-          <w:sz w:val="22"/>
-          <w:szCs w:val="22"/>
-        </w:rPr>
-        <w:t>in Addition to Above Prizes</w:t>
-      </w:r>
-    </w:p>
-    <w:p>
-      <w:pPr>
-        <w:tabs>
-          <w:tab w:val="left" w:pos="916"/>
-          <w:tab w:val="left" w:pos="1832"/>
-          <w:tab w:val="left" w:pos="2748"/>
-          <w:tab w:val="left" w:pos="3664"/>
-          <w:tab w:val="left" w:pos="4580"/>
-          <w:tab w:val="left" w:pos="5496"/>
-          <w:tab w:val="left" w:pos="6412"/>
-          <w:tab w:val="left" w:pos="7328"/>
-          <w:tab w:val="left" w:pos="8244"/>
-          <w:tab w:val="left" w:pos="9160"/>
-          <w:tab w:val="left" w:pos="10076"/>
-          <w:tab w:val="left" w:pos="10992"/>
-          <w:tab w:val="left" w:pos="11908"/>
-          <w:tab w:val="left" w:pos="12824"/>
-          <w:tab w:val="left" w:pos="13740"/>
-          <w:tab w:val="left" w:pos="14656"/>
-        </w:tabs>
-        <w:jc w:val="center"/>
-      </w:pPr>
-      <w:r>
-        <w:t>Open: $50 per win/$25 per draw; Reserve: $20 per win/$10 per draw; Perfect Score Prizes for Females: $80 in Open/$40 in Reserve</w:t>
-      </w:r>
-      <w:r>
-        <w:t>.</w:t>
-      </w:r>
-      <w:r>
-        <w:t xml:space="preserve"> </w:t>
-      </w:r>
-    </w:p>
-    <w:p>
-      <w:pPr>
-        <w:jc w:val="center"/>
         <w:rPr>
           <w:rFonts w:ascii="Arial" w:hAnsi="Arial" w:cs="Arial"/>
           <w:sz w:val="22"/>

</xml_diff>